<commit_message>
Registrar cambios en i-doit y actualizar informe
</commit_message>
<xml_diff>
--- a/Laboratorio_2_Gestion_Cambios_SIGAE.docx
+++ b/Laboratorio_2_Gestion_Cambios_SIGAE.docx
@@ -415,7 +415,7 @@
       </w:pPr>
       <w:r>
         <w:rPr/>
-        <w:t xml:space="preserve">Se preparó un registro diferenciado para cinco cambios. Cada registro relaciona cambios con requisitos del Laboratorio 1 y define una condición de cierre para su posterior carga en i-doit.</w:t>
+        <w:t xml:space="preserve">Se registraron cinco cambios en i-doit como objetos CMDB. Cada registro relaciona cambios con requisitos del Laboratorio 1, incluye responsable, estado y condición de cierre.</w:t>
       </w:r>
     </w:p>
     <w:p>
@@ -1759,7 +1759,7 @@
       </w:pPr>
       <w:r>
         <w:rPr/>
-        <w:t xml:space="preserve">La evidencia disponible fue la respuesta correcta de i-doit en la instalación local y la preparación del catálogo. La carga definitiva en i-doit y la publicación en GitHub requieren autorización, por lo que se presentan como actividades pendientes y no como resultados simulados.</w:t>
+        <w:t xml:space="preserve">La evidencia disponible fue la respuesta correcta de i-doit en la instalación local y la consulta de los cinco objetos CMDB registrados. La publicación en GitHub requiere autorización, por lo que permanece como actividad pendiente y no se presenta como resultado simulado.</w:t>
       </w:r>
     </w:p>
     <w:p>
@@ -1768,7 +1768,7 @@
       </w:pPr>
       <w:r>
         <w:rPr/>
-        <w:t xml:space="preserve">Se esperaba obtener cinco registros trazables y un reporte de estados. Se obtuvo el diseño completo de los registros, la secuencia y los criterios de aceptación, además de la verificación de i-doit. GitHub no pudo comprobarse porque no existe remoto ni credencial.</w:t>
+        <w:t xml:space="preserve">Se esperaba obtener cinco registros trazables y un reporte de estados. Se obtuvieron cinco objetos CMDB en i-doit, con identificadores internos 26 a 30, además de la secuencia y los criterios de aceptación. GitHub no pudo publicarse porque falta autenticación externa.</w:t>
       </w:r>
     </w:p>
     <w:p>

</xml_diff>